<commit_message>
Đồng bộ hai website theo app bản 224 (Âm nhạc 1 chia tiết đúng SGV KNTT)
Co-Authored-By: Claude Opus 5 (1M context) <noreply@anthropic.com>
Claude-Session: https://claude.ai/code/session_01RUrX4ZtYx5tevhjTzJSXRj
</commit_message>
<xml_diff>
--- a/assets/docs/lop1/Am nhac - Lop 1.docx
+++ b/assets/docs/lop1/Am nhac - Lop 1.docx
@@ -585,7 +585,7 @@
                 <w:i w:val="0"/>
                 <w:sz w:val="20"/>
               </w:rPr>
-              <w:t>Chủ đề 1: Âm thanh kì diệu — Học hát: Vào rừng hoa (Việt Anh)</w:t>
+              <w:t>Chủ đề 1: Âm thanh kì diệu — Thường thức âm nhạc: Âm thanh kì diệu; Học hát: Vào rừng hoa (Việt Anh)</w:t>
             </w:r>
           </w:p>
         </w:tc>
@@ -702,7 +702,7 @@
                 <w:i w:val="0"/>
                 <w:sz w:val="20"/>
               </w:rPr>
-              <w:t>Chủ đề 1: Âm thanh kì diệu — Ôn bài hát Vào rừng hoa; Thường thức âm nhạc: Câu chuyện "Âm thanh kì diệu"</w:t>
+              <w:t>Chủ đề 1: Âm thanh kì diệu — Ôn bài hát Vào rừng hoa; Đọc nhạc: Bậc thang Đô – Rê – Mi; Vận dụng – Sáng tạo: To – Nhỏ</w:t>
             </w:r>
           </w:p>
         </w:tc>
@@ -741,7 +741,20 @@
                 <w:i w:val="0"/>
                 <w:sz w:val="18"/>
               </w:rPr>
-              <w:t>Năng lực số 1.1 CB1a: HS nghe các đoạn âm thanh GV mở từ học liệu số và nói được đó là tiếng gì</w:t>
+              <w:t>NLS: Năng lực số 3.1 CB1a: HS cùng GV tạo bản ghi âm đoạn đọc to – nhỏ của lớp và nghe lại</w:t>
+            </w:r>
+          </w:p>
+          <w:p>
+            <w:pPr>
+              <w:spacing w:after="0"/>
+            </w:pPr>
+            <w:r>
+              <w:rPr>
+                <w:b w:val="0"/>
+                <w:i w:val="0"/>
+                <w:sz w:val="18"/>
+              </w:rPr>
+              <w:t>KNS: KN tự tin biểu diễn trước tập thể và phối hợp cùng nhóm.</w:t>
             </w:r>
           </w:p>
         </w:tc>
@@ -936,7 +949,7 @@
                 <w:i w:val="0"/>
                 <w:sz w:val="20"/>
               </w:rPr>
-              <w:t>Chủ đề 1: Âm thanh kì diệu — Vận dụng – Sáng tạo: To – Nhỏ</w:t>
+              <w:t>Chủ đề 1: Âm thanh kì diệu — Ôn bài hát Vào rừng hoa; Ôn đọc nhạc: Bậc thang Đô – Rê – Mi; Vận dụng – Sáng tạo: To – Nhỏ</w:t>
             </w:r>
           </w:p>
         </w:tc>
@@ -975,7 +988,7 @@
                 <w:i w:val="0"/>
                 <w:sz w:val="18"/>
               </w:rPr>
-              <w:t>NLS: Năng lực số 3.1 CB1a: HS cùng GV tạo bản ghi âm đoạn đọc to – nhỏ của lớp và nghe lại</w:t>
+              <w:t>Năng lực số 1.1 CB1a: HS nhìn dòng nhạc Đô – Rê – Mi trên màn hình, nghe tiếng đàn và chỉ ra nốt được đọc to hơn</w:t>
             </w:r>
           </w:p>
           <w:p>
@@ -1066,7 +1079,7 @@
                 <w:i w:val="0"/>
                 <w:sz w:val="20"/>
               </w:rPr>
-              <w:t>Chủ đề 2: Việt Nam yêu thương — Học hát: Tổ quốc ta (Mộng Lân)</w:t>
+              <w:t>Chủ đề 2: Việt Nam yêu thương — Học hát: Tổ quốc ta (Mộng Lân); Vận dụng – Sáng tạo: Cao – Thấp</w:t>
             </w:r>
           </w:p>
         </w:tc>
@@ -1326,7 +1339,7 @@
                 <w:i w:val="0"/>
                 <w:sz w:val="20"/>
               </w:rPr>
-              <w:t>Chủ đề 2: Việt Nam yêu thương — Nhạc cụ: Gõ đệm trống con cho bài Tổ quốc ta; Nghe nhạc: Quốc ca (Văn Cao)</w:t>
+              <w:t>Chủ đề 2: Việt Nam yêu thương — Nghe nhạc: Quốc ca (Văn Cao); Nhạc cụ: Trống con</w:t>
             </w:r>
           </w:p>
         </w:tc>
@@ -1456,7 +1469,7 @@
                 <w:i w:val="0"/>
                 <w:sz w:val="20"/>
               </w:rPr>
-              <w:t>Chủ đề 2: Việt Nam yêu thương — Vận dụng – Sáng tạo: Cao – Thấp</w:t>
+              <w:t>Chủ đề 2: Việt Nam yêu thương — Ôn bài hát Tổ quốc ta; Vận dụng – Sáng tạo: Cao – Thấp</w:t>
             </w:r>
           </w:p>
         </w:tc>
@@ -1495,7 +1508,7 @@
                 <w:i w:val="0"/>
                 <w:sz w:val="18"/>
               </w:rPr>
-              <w:t>Năng lực số 1.1 CB1a: HS nghe âm thanh GV mở từ học liệu số và nói được âm nào cao, âm nào thấp</w:t>
+              <w:t>Năng lực số 1.1 CB1a: HS nghe tiếng kèn tu-ba, sáo pic-cô-lô GV mở từ học liệu số và nói được âm nào cao, âm nào thấp</w:t>
             </w:r>
           </w:p>
           <w:p>
@@ -1586,7 +1599,7 @@
                 <w:i w:val="0"/>
                 <w:sz w:val="20"/>
               </w:rPr>
-              <w:t>Chủ đề 3: Mái trường thân yêu — Học hát: Lớp Một thân yêu (Bùi Anh Tôn)</w:t>
+              <w:t>Chủ đề 3: Mái trường thân yêu — Học hát: Lớp Một thân yêu (Bùi Anh Tôn); Vận dụng – Sáng tạo: To – Nhỏ, Cao – Thấp</w:t>
             </w:r>
           </w:p>
         </w:tc>
@@ -1626,6 +1639,19 @@
                 <w:sz w:val="18"/>
               </w:rPr>
               <w:t>Năng lực số 3.3 CB1a: HS nói được tên bài hát Lớp Một thân yêu cùng tên tác giả Bùi Anh Tôn</w:t>
+            </w:r>
+          </w:p>
+          <w:p>
+            <w:pPr>
+              <w:spacing w:after="0"/>
+            </w:pPr>
+            <w:r>
+              <w:rPr>
+                <w:b w:val="0"/>
+                <w:i w:val="0"/>
+                <w:sz w:val="18"/>
+              </w:rPr>
+              <w:t>KNS: KN tự tin biểu diễn trước tập thể và phối hợp cùng nhóm.</w:t>
             </w:r>
           </w:p>
         </w:tc>
@@ -1937,7 +1963,7 @@
                 <w:i w:val="0"/>
                 <w:sz w:val="20"/>
               </w:rPr>
-              <w:t>Chủ đề 3: Mái trường thân yêu — Vận dụng – Sáng tạo: To – Nhỏ, Cao – Thấp</w:t>
+              <w:t>Chủ đề 3: Mái trường thân yêu — Ôn bài hát Lớp Một thân yêu; Ôn đọc nhạc: Ban nhạc Đô – Rê – Mi; Vận dụng – Sáng tạo: To – Nhỏ, Cao – Thấp</w:t>
             </w:r>
           </w:p>
         </w:tc>
@@ -2665,7 +2691,7 @@
                 <w:i w:val="0"/>
                 <w:sz w:val="20"/>
               </w:rPr>
-              <w:t>Chủ đề 5: Nhịp điệu mùa xuân — Học hát: Xúc xắc xúc xẻ (Nhạc: Nguyễn Ngọc Thiện, lời: phỏng theo đồng dao)</w:t>
+              <w:t>Chủ đề 5: Nhịp điệu mùa xuân — Học hát: Xúc xắc xúc xẻ (Nhạc: Nguyễn Ngọc Thiện, lời: phỏng theo đồng dao); Vận dụng – Sáng tạo: Dài – Ngắn</w:t>
             </w:r>
           </w:p>
         </w:tc>
@@ -2705,6 +2731,19 @@
                 <w:sz w:val="18"/>
               </w:rPr>
               <w:t>Năng lực số 3.3 CB1a: HS nói được tên bài hát cùng tên tác giả phần nhạc và nguồn lời ca phỏng theo đồng dao</w:t>
+            </w:r>
+          </w:p>
+          <w:p>
+            <w:pPr>
+              <w:spacing w:after="0"/>
+            </w:pPr>
+            <w:r>
+              <w:rPr>
+                <w:b w:val="0"/>
+                <w:i w:val="0"/>
+                <w:sz w:val="18"/>
+              </w:rPr>
+              <w:t>KNS: KN tự tin biểu diễn trước tập thể và phối hợp cùng nhóm.</w:t>
             </w:r>
           </w:p>
         </w:tc>
@@ -2923,7 +2962,7 @@
                 <w:i w:val="0"/>
                 <w:sz w:val="20"/>
               </w:rPr>
-              <w:t>Chủ đề 5: Nhịp điệu mùa xuân — Thường thức âm nhạc: Nhạc sĩ Mô-da (Câu chuyện "Thần đồng âm nhạc Mô-da"); Nghe nhạc: Khát vọng mùa xuân</w:t>
+              <w:t>Chủ đề 5: Nhịp điệu mùa xuân — Ôn đọc nhạc: Những người bạn của Đô – Rê – Mi; Thường thức âm nhạc: Nhạc sĩ Vôn-gang A-ma-đớt Mô-da (nghe bài hát Khát vọng mùa xuân); Vận dụng – Sáng tạo: Dài – Ngắn</w:t>
             </w:r>
           </w:p>
         </w:tc>
@@ -2962,7 +3001,20 @@
                 <w:i w:val="0"/>
                 <w:sz w:val="18"/>
               </w:rPr>
-              <w:t>Năng lực số 1.1 CB1a: HS xem hình, nghe GV giới thiệu và nói được tên nhạc sĩ Mô-da, tên bản nhạc vừa nghe</w:t>
+              <w:t>Năng lực số 1.1 CB1a: HS xem hình, nghe GV giới thiệu và nói được tên nhạc sĩ Mô-da, tên bài hát Khát vọng mùa xuân</w:t>
+            </w:r>
+          </w:p>
+          <w:p>
+            <w:pPr>
+              <w:spacing w:after="0"/>
+            </w:pPr>
+            <w:r>
+              <w:rPr>
+                <w:b w:val="0"/>
+                <w:i w:val="0"/>
+                <w:sz w:val="18"/>
+              </w:rPr>
+              <w:t>KNS: KN tự tin biểu diễn trước tập thể và phối hợp cùng nhóm.</w:t>
             </w:r>
           </w:p>
         </w:tc>
@@ -3040,7 +3092,7 @@
                 <w:i w:val="0"/>
                 <w:sz w:val="20"/>
               </w:rPr>
-              <w:t>Chủ đề 5: Nhịp điệu mùa xuân — Vận dụng – Sáng tạo: Dài – Ngắn</w:t>
+              <w:t>Chủ đề 5: Nhịp điệu mùa xuân — Ôn bài hát Xúc xắc xúc xẻ; Vận dụng – Sáng tạo: Dài – Ngắn</w:t>
             </w:r>
           </w:p>
         </w:tc>
@@ -3170,7 +3222,7 @@
                 <w:i w:val="0"/>
                 <w:sz w:val="20"/>
               </w:rPr>
-              <w:t>Chủ đề 6: Về miền dân ca — Học hát: Gà gáy (Dân ca Cống Khao, lời mới: Huy Trân)</w:t>
+              <w:t>Chủ đề 6: Về miền dân ca — Học hát: Gà gáy (Dân ca Cống Khao, lời mới: Huy Trân); Vận dụng – Sáng tạo: Dài – Ngắn</w:t>
             </w:r>
           </w:p>
         </w:tc>
@@ -3210,6 +3262,19 @@
                 <w:sz w:val="18"/>
               </w:rPr>
               <w:t>Năng lực số 3.3 CB1a: HS nói được bài Gà gáy là dân ca Cống Khao và người viết lời mới là Huy Trân</w:t>
+            </w:r>
+          </w:p>
+          <w:p>
+            <w:pPr>
+              <w:spacing w:after="0"/>
+            </w:pPr>
+            <w:r>
+              <w:rPr>
+                <w:b w:val="0"/>
+                <w:i w:val="0"/>
+                <w:sz w:val="18"/>
+              </w:rPr>
+              <w:t>KNS: KN tự tin biểu diễn trước tập thể và phối hợp cùng nhóm.</w:t>
             </w:r>
           </w:p>
         </w:tc>
@@ -3287,7 +3352,7 @@
                 <w:i w:val="0"/>
                 <w:sz w:val="20"/>
               </w:rPr>
-              <w:t>Chủ đề 6: Về miền dân ca — Ôn bài hát Gà gáy; Thường thức âm nhạc: "Câu chuyện về thanh phách"</w:t>
+              <w:t>Chủ đề 6: Về miền dân ca — Ôn bài hát Gà gáy; Nhạc cụ: Thanh phách</w:t>
             </w:r>
           </w:p>
         </w:tc>
@@ -3326,7 +3391,7 @@
                 <w:i w:val="0"/>
                 <w:sz w:val="18"/>
               </w:rPr>
-              <w:t>Năng lực số 1.1 CB1a: HS xem hình, nghe âm thanh trên màn hình và nói đúng tên nhạc cụ thanh phách</w:t>
+              <w:t>Năng lực số 3.1 CB1a: HS cùng GV ghi âm phần cả lớp hát Gà gáy kết hợp gõ thanh phách và nghe lại để nhận xét tiếng phách đã đều chưa</w:t>
             </w:r>
           </w:p>
         </w:tc>
@@ -3404,7 +3469,7 @@
                 <w:i w:val="0"/>
                 <w:sz w:val="20"/>
               </w:rPr>
-              <w:t>Chủ đề 6: Về miền dân ca — Nhạc cụ: Thanh phách; Nghe nhạc: Lí cây bông (Dân ca Nam Bộ)</w:t>
+              <w:t>Chủ đề 6: Về miền dân ca — Thường thức âm nhạc: Câu chuyện về thanh phách; Vận dụng – Sáng tạo: Dài – Ngắn</w:t>
             </w:r>
           </w:p>
         </w:tc>
@@ -3443,7 +3508,20 @@
                 <w:i w:val="0"/>
                 <w:sz w:val="18"/>
               </w:rPr>
-              <w:t>Năng lực số 4.1 CB1a: HS ngồi đúng khoảng cách với màn hình, nghe loa vừa đủ khi xem, nghe bài Lí cây bông</w:t>
+              <w:t>Năng lực số 1.1 CB1a: HS xem hình, nghe âm thanh trên màn hình và nói đúng tên nhạc cụ thanh phách</w:t>
+            </w:r>
+          </w:p>
+          <w:p>
+            <w:pPr>
+              <w:spacing w:after="0"/>
+            </w:pPr>
+            <w:r>
+              <w:rPr>
+                <w:b w:val="0"/>
+                <w:i w:val="0"/>
+                <w:sz w:val="18"/>
+              </w:rPr>
+              <w:t>KNS: KN tự tin biểu diễn trước tập thể và phối hợp cùng nhóm.</w:t>
             </w:r>
           </w:p>
         </w:tc>
@@ -3521,7 +3599,7 @@
                 <w:i w:val="0"/>
                 <w:sz w:val="20"/>
               </w:rPr>
-              <w:t>Chủ đề 6: Về miền dân ca — Vận dụng – Sáng tạo: Dài – Ngắn</w:t>
+              <w:t>Chủ đề 6: Về miền dân ca — Ôn bài hát Gà gáy; Nghe nhạc: Lí cây bông (Dân ca Nam Bộ)</w:t>
             </w:r>
           </w:p>
         </w:tc>
@@ -3560,20 +3638,7 @@
                 <w:i w:val="0"/>
                 <w:sz w:val="18"/>
               </w:rPr>
-              <w:t>Năng lực số 2.1 CB1a: HS nói lời chào buổi sáng để GV ghi lại thành lời nhắn gửi bạn lớp bên</w:t>
-            </w:r>
-          </w:p>
-          <w:p>
-            <w:pPr>
-              <w:spacing w:after="0"/>
-            </w:pPr>
-            <w:r>
-              <w:rPr>
-                <w:b w:val="0"/>
-                <w:i w:val="0"/>
-                <w:sz w:val="18"/>
-              </w:rPr>
-              <w:t>KNS: KN tự tin biểu diễn trước tập thể và phối hợp cùng nhóm.</w:t>
+              <w:t>Năng lực số 4.1 CB1a: HS ngồi đúng khoảng cách với màn hình, nghe loa vừa đủ khi xem, nghe bài Lí cây bông</w:t>
             </w:r>
           </w:p>
         </w:tc>
@@ -3651,7 +3716,7 @@
                 <w:i w:val="0"/>
                 <w:sz w:val="20"/>
               </w:rPr>
-              <w:t>Chủ đề 7: Gia đình — Học hát: Cây gia đình (Nhạc: Quỳnh Hợp, lời thơ: Nguyễn Thị Mai)</w:t>
+              <w:t>Chủ đề 7: Gia đình — Học hát: Cây gia đình (Nhạc: Quỳnh Hợp, lời thơ: Nguyễn Thị Mai); Vận dụng – Sáng tạo: Góc âm nhạc</w:t>
             </w:r>
           </w:p>
         </w:tc>
@@ -3691,6 +3756,19 @@
                 <w:sz w:val="18"/>
               </w:rPr>
               <w:t>NLS: Năng lực số 3.3 CB1a: HS nói được tên bài hát cùng tên tác giả nhạc và tác giả lời thơ</w:t>
+            </w:r>
+          </w:p>
+          <w:p>
+            <w:pPr>
+              <w:spacing w:after="0"/>
+            </w:pPr>
+            <w:r>
+              <w:rPr>
+                <w:b w:val="0"/>
+                <w:i w:val="0"/>
+                <w:sz w:val="18"/>
+              </w:rPr>
+              <w:t>KNS: KN tự tin biểu diễn trước tập thể và phối hợp cùng nhóm.</w:t>
             </w:r>
           </w:p>
         </w:tc>
@@ -4002,7 +4080,7 @@
                 <w:i w:val="0"/>
                 <w:sz w:val="20"/>
               </w:rPr>
-              <w:t>Chủ đề 7: Gia đình — Vận dụng – Sáng tạo: Góc âm nhạc</w:t>
+              <w:t>Chủ đề 7: Gia đình — Vận dụng – Sáng tạo: Góc âm nhạc; Ôn bài hát Cây gia đình</w:t>
             </w:r>
           </w:p>
         </w:tc>
@@ -4249,7 +4327,7 @@
                 <w:i w:val="0"/>
                 <w:sz w:val="20"/>
               </w:rPr>
-              <w:t>Chủ đề 8: Vui đón hè — Ôn bài hát Ngôi sao lấp lánh; Nhạc cụ: Trai-en-gô</w:t>
+              <w:t>Chủ đề 8: Vui đón hè — Nhạc cụ: Trai-en-gô (triangle); Ôn bài hát Ngôi sao lấp lánh</w:t>
             </w:r>
           </w:p>
         </w:tc>

</xml_diff>